<commit_message>
fix(correct-identity-provider-naming): Keycloak, proveedor de identidad
"ClickCloud" era un error de transcripcion: el componente es Keycloak, un
proveedor de identidad (IdP), no un gestor de secretos.

- ERS v1.4: glosario, 2.4, 2.5, RF-03, 3.3, 3.4 y tabla de RN reescritos
  al concepto correcto; RN-HU03-01 corregida; portada, pie y fila 1.4 del
  control de versiones. Editado sobre el XML, sin tocar el formato.
- README, EP-01, docstrings y pruebas de acceso de proveedores.
- Sin cambios de comportamiento.

Co-Authored-By: Claude Opus 5.5 <noreply@anthropic.com>
</commit_message>
<xml_diff>
--- a/docs/source-of-truth/ERS_Portal_Proveedores_ULTRASIST_MVP.docx
+++ b/docs/source-of-truth/ERS_Portal_Proveedores_ULTRASIST_MVP.docx
@@ -82,7 +82,7 @@
           <w:sz w:val="24"/>
           <w:szCs w:val="24"/>
         </w:rPr>
-        <w:t xml:space="preserve">Versión 1.3</w:t>
+        <w:t xml:space="preserve">Versión 1.4</w:t>
       </w:r>
     </w:p>
     <w:p>
@@ -97,7 +97,7 @@
           <w:sz w:val="22"/>
           <w:szCs w:val="22"/>
         </w:rPr>
-        <w:t xml:space="preserve">23 de septiembre de 2026</w:t>
+        <w:t xml:space="preserve">30 de septiembre de 2026</w:t>
       </w:r>
     </w:p>
     <w:p>
@@ -694,6 +694,104 @@
           </w:p>
         </w:tc>
       </w:tr>
+      <w:tr>
+        <w:tc>
+          <w:tcPr>
+            <w:tcW w:type="dxa" w:w="1000"/>
+            <w:tcMar>
+              <w:top w:type="dxa" w:w="50"/>
+              <w:left w:type="dxa" w:w="90"/>
+              <w:bottom w:type="dxa" w:w="50"/>
+              <w:right w:type="dxa" w:w="90"/>
+            </w:tcMar>
+          </w:tcPr>
+          <w:p>
+            <w:pPr>
+              <w:spacing w:after="30" w:line="260"/>
+            </w:pPr>
+            <w:r>
+              <w:rPr>
+                <w:rFonts w:ascii="Calibri" w:cs="Calibri" w:eastAsia="Calibri" w:hAnsi="Calibri"/>
+                <w:sz w:val="20"/>
+                <w:szCs w:val="20"/>
+              </w:rPr>
+              <w:t xml:space="preserve">1.4</w:t>
+            </w:r>
+          </w:p>
+        </w:tc>
+        <w:tc>
+          <w:tcPr>
+            <w:tcW w:type="dxa" w:w="1500"/>
+            <w:tcMar>
+              <w:top w:type="dxa" w:w="50"/>
+              <w:left w:type="dxa" w:w="90"/>
+              <w:bottom w:type="dxa" w:w="50"/>
+              <w:right w:type="dxa" w:w="90"/>
+            </w:tcMar>
+          </w:tcPr>
+          <w:p>
+            <w:pPr>
+              <w:spacing w:after="30" w:line="260"/>
+            </w:pPr>
+            <w:r>
+              <w:rPr>
+                <w:rFonts w:ascii="Calibri" w:cs="Calibri" w:eastAsia="Calibri" w:hAnsi="Calibri"/>
+                <w:sz w:val="20"/>
+                <w:szCs w:val="20"/>
+              </w:rPr>
+              <w:t xml:space="preserve">30/09/2026</w:t>
+            </w:r>
+          </w:p>
+        </w:tc>
+        <w:tc>
+          <w:tcPr>
+            <w:tcW w:type="dxa" w:w="2500"/>
+            <w:tcMar>
+              <w:top w:type="dxa" w:w="50"/>
+              <w:left w:type="dxa" w:w="90"/>
+              <w:bottom w:type="dxa" w:w="50"/>
+              <w:right w:type="dxa" w:w="90"/>
+            </w:tcMar>
+          </w:tcPr>
+          <w:p>
+            <w:pPr>
+              <w:spacing w:after="30" w:line="260"/>
+            </w:pPr>
+            <w:r>
+              <w:rPr>
+                <w:rFonts w:ascii="Calibri" w:cs="Calibri" w:eastAsia="Calibri" w:hAnsi="Calibri"/>
+                <w:sz w:val="20"/>
+                <w:szCs w:val="20"/>
+              </w:rPr>
+              <w:t xml:space="preserve">Equipo Técnico</w:t>
+            </w:r>
+          </w:p>
+        </w:tc>
+        <w:tc>
+          <w:tcPr>
+            <w:tcW w:type="dxa" w:w="4360"/>
+            <w:tcMar>
+              <w:top w:type="dxa" w:w="50"/>
+              <w:left w:type="dxa" w:w="90"/>
+              <w:bottom w:type="dxa" w:w="50"/>
+              <w:right w:type="dxa" w:w="90"/>
+            </w:tcMar>
+          </w:tcPr>
+          <w:p>
+            <w:pPr>
+              <w:spacing w:after="30" w:line="260"/>
+            </w:pPr>
+            <w:r>
+              <w:rPr>
+                <w:rFonts w:ascii="Calibri" w:cs="Calibri" w:eastAsia="Calibri" w:hAnsi="Calibri"/>
+                <w:sz w:val="20"/>
+                <w:szCs w:val="20"/>
+              </w:rPr>
+              <w:t xml:space="preserve">Corrección de nomenclatura: “ClickCloud” era un error de transcripción; el componente es Keycloak, un proveedor de identidad (IdP), no un gestor de secretos. Se reformula RN-HU03-01 y se ajustan 1.3, 2.4, 2.5, RF-03, 3.3, 3.4 y 3.5.</w:t>
+            </w:r>
+          </w:p>
+        </w:tc>
+      </w:tr>
     </w:tbl>
     <w:p>
       <w:pPr>
@@ -1311,7 +1409,7 @@
                 <w:sz w:val="20"/>
                 <w:szCs w:val="20"/>
               </w:rPr>
-              <w:t xml:space="preserve">ClickCloud</w:t>
+              <w:t xml:space="preserve">Keycloak</w:t>
             </w:r>
           </w:p>
         </w:tc>
@@ -1335,7 +1433,7 @@
                 <w:sz w:val="20"/>
                 <w:szCs w:val="20"/>
               </w:rPr>
-              <w:t xml:space="preserve">Gestor de secretos donde se resguarda la contraseña temporal del proveedor (RN-HU03-01).</w:t>
+              <w:t xml:space="preserve">Proveedor de identidad (IdP): servidor de autenticación OIDC que gestiona las cuentas de los usuarios del portal y sus credenciales, incluida la contraseña temporal del proveedor (RN-HU03-01).</w:t>
             </w:r>
           </w:p>
         </w:tc>
@@ -1930,7 +2028,7 @@
           <w:sz w:val="22"/>
           <w:szCs w:val="22"/>
         </w:rPr>
-        <w:t xml:space="preserve">La contraseña temporal debe resguardarse en un gestor de secretos (ClickCloud) y no dentro del sistema de proveedores (RN-HU03-01).</w:t>
+        <w:t xml:space="preserve">Las credenciales del proveedor, incluida la contraseña temporal, deben gestionarse en el proveedor de identidad (Keycloak); el sistema de proveedores no almacena contraseñas ni sus hashes (RN-HU03-01).</w:t>
       </w:r>
     </w:p>
     <w:p>
@@ -2019,7 +2117,7 @@
           <w:sz w:val="22"/>
           <w:szCs w:val="22"/>
         </w:rPr>
-        <w:t xml:space="preserve">Se asume la disponibilidad del gestor de secretos (ClickCloud) para el resguardo de contraseñas temporales.</w:t>
+        <w:t xml:space="preserve">Se asume la disponibilidad del proveedor de identidad (Keycloak) para la autenticación de los usuarios y la gestión de sus credenciales.</w:t>
       </w:r>
     </w:p>
     <w:p>
@@ -4646,7 +4744,7 @@
           <w:sz w:val="21"/>
           <w:szCs w:val="21"/>
         </w:rPr>
-        <w:t xml:space="preserve">La contraseña temporal deberá resguardarse en ClickCloud (gestor de secretos) y no almacenarse dentro del sistema de proveedores (RN-HU03-01).</w:t>
+        <w:t xml:space="preserve">La contraseña temporal deberá gestionarse en el proveedor de identidad (Keycloak) y no almacenarse, ni en claro ni como hash, dentro del sistema de proveedores (RN-HU03-01).</w:t>
       </w:r>
     </w:p>
     <w:p>
@@ -7819,7 +7917,7 @@
           <w:sz w:val="22"/>
           <w:szCs w:val="22"/>
         </w:rPr>
-        <w:t xml:space="preserve">Gestor de secretos (ClickCloud): almacenamiento seguro de la contraseña temporal del proveedor.</w:t>
+        <w:t xml:space="preserve">Proveedor de identidad (Keycloak): autenticación OIDC de los usuarios del portal y gestión de sus credenciales, incluida la contraseña temporal del proveedor.</w:t>
       </w:r>
     </w:p>
     <w:p>
@@ -7916,7 +8014,7 @@
           <w:sz w:val="22"/>
           <w:szCs w:val="22"/>
         </w:rPr>
-        <w:t xml:space="preserve">cambio obligatorio de contraseña en el primer acceso; política de complejidad (≥8 caracteres, letra, número y carácter especial); resguardo de contraseñas temporales en gestor de secretos, sin persistirlas en el sistema.</w:t>
+        <w:t xml:space="preserve">cambio obligatorio de contraseña en el primer acceso; política de complejidad (≥8 caracteres, letra, número y carácter especial); gestión de credenciales, incluidas las contraseñas temporales, en el proveedor de identidad (Keycloak), sin persistirlas ni guardar sus hashes en el sistema.</w:t>
       </w:r>
     </w:p>
     <w:p>
@@ -8347,7 +8445,7 @@
                 <w:sz w:val="20"/>
                 <w:szCs w:val="20"/>
               </w:rPr>
-              <w:t xml:space="preserve">La contraseña temporal del proveedor se resguarda en ClickCloud, evitando almacenarla dentro del sistema de proveedores.</w:t>
+              <w:t xml:space="preserve">Las credenciales del proveedor, incluida la contraseña temporal, se gestionan exclusivamente en el proveedor de identidad (Keycloak); el sistema de proveedores no almacena contraseñas ni sus hashes.</w:t>
             </w:r>
           </w:p>
         </w:tc>
@@ -13449,7 +13547,7 @@
         <w:sz w:val="16"/>
         <w:szCs w:val="16"/>
       </w:rPr>
-      <w:t xml:space="preserve">ERS — Portal de Proveedores ULTRASIST (MVP) · v1.3 · Página </w:t>
+      <w:t xml:space="preserve">ERS — Portal de Proveedores ULTRASIST (MVP) · v1.4 · Página </w:t>
     </w:r>
     <w:r>
       <w:rPr>

</xml_diff>